<commit_message>
Add part 1.1 of second assignment
</commit_message>
<xml_diff>
--- a/Assignments/Assignment2/Team Report.docx
+++ b/Assignments/Assignment2/Team Report.docx
@@ -416,7 +416,7 @@
           <w:szCs w:val="48"/>
           <w:lang w:val="en-US"/>
         </w:rPr>
-        <w:t>Software Requirements Specification</w:t>
+        <w:t>Object-Oriented System Design</w:t>
       </w:r>
     </w:p>
     <w:p>
@@ -775,7 +775,7 @@
       </w:r>
       <w:r>
         <w:rPr>
-          <w:rFonts w:hint="default" w:cs="Times New Roman"/>
+          <w:rFonts w:hint="default" w:ascii="Times New Roman" w:hAnsi="Times New Roman" w:cs="Times New Roman"/>
           <w:sz w:val="28"/>
           <w:szCs w:val="28"/>
           <w:lang w:val="en-US"/>
@@ -793,7 +793,7 @@
       </w:r>
       <w:r>
         <w:rPr>
-          <w:rFonts w:hint="default" w:cs="Times New Roman"/>
+          <w:rFonts w:hint="default" w:ascii="Times New Roman" w:hAnsi="Times New Roman" w:cs="Times New Roman"/>
           <w:sz w:val="28"/>
           <w:szCs w:val="28"/>
           <w:lang w:val="en-US"/>
@@ -802,7 +802,7 @@
       </w:r>
       <w:r>
         <w:rPr>
-          <w:rFonts w:hint="default" w:cs="Times New Roman"/>
+          <w:rFonts w:hint="default" w:ascii="Times New Roman" w:hAnsi="Times New Roman" w:cs="Times New Roman"/>
           <w:sz w:val="28"/>
           <w:szCs w:val="28"/>
           <w:vertAlign w:val="superscript"/>
@@ -852,8 +852,6 @@
         </w:rPr>
         <w:t xml:space="preserve">: </w:t>
       </w:r>
-      <w:bookmarkStart w:id="1" w:name="_GoBack"/>
-      <w:bookmarkEnd w:id="1"/>
     </w:p>
     <w:p>
       <w:pPr>
@@ -920,7 +918,7 @@
       </w:r>
       <w:r>
         <w:rPr>
-          <w:rFonts w:hint="default" w:cs="Times New Roman"/>
+          <w:rFonts w:hint="default" w:ascii="Times New Roman" w:hAnsi="Times New Roman" w:cs="Times New Roman"/>
           <w:sz w:val="28"/>
           <w:szCs w:val="28"/>
           <w:lang w:val="en-US"/>
@@ -965,6 +963,9 @@
         <w:widowControl/>
         <w:suppressLineNumbers w:val="0"/>
         <w:jc w:val="left"/>
+        <w:rPr>
+          <w:rFonts w:hint="default" w:ascii="Times New Roman" w:hAnsi="Times New Roman" w:cs="Times New Roman"/>
+        </w:rPr>
       </w:pPr>
     </w:p>
     <w:p>
@@ -1321,13 +1322,13 @@
         <w:bidi w:val="0"/>
         <w:ind w:left="2157" w:leftChars="0" w:firstLine="719" w:firstLineChars="0"/>
         <w:rPr>
-          <w:rFonts w:hint="default"/>
-          <w:lang w:val="en-US"/>
-        </w:rPr>
-      </w:pPr>
-      <w:r>
-        <w:rPr>
-          <w:rFonts w:hint="default"/>
+          <w:rFonts w:hint="default" w:ascii="Times New Roman" w:hAnsi="Times New Roman" w:cs="Times New Roman"/>
+          <w:lang w:val="en-US"/>
+        </w:rPr>
+      </w:pPr>
+      <w:r>
+        <w:rPr>
+          <w:rFonts w:hint="default" w:ascii="Times New Roman" w:hAnsi="Times New Roman" w:cs="Times New Roman"/>
           <w:lang w:val="en-US"/>
         </w:rPr>
         <w:t>Table of Contents</w:t>
@@ -1341,36 +1342,36 @@
         </w:tabs>
         <w:ind w:left="0" w:leftChars="0" w:firstLine="0" w:firstLineChars="0"/>
         <w:rPr>
-          <w:rFonts w:hint="default"/>
-          <w:sz w:val="28"/>
-          <w:szCs w:val="28"/>
-          <w:lang w:val="en-US"/>
-        </w:rPr>
-      </w:pPr>
-      <w:r>
-        <w:rPr>
-          <w:rFonts w:hint="default"/>
+          <w:rFonts w:hint="default" w:ascii="Times New Roman" w:hAnsi="Times New Roman" w:cs="Times New Roman"/>
+          <w:sz w:val="28"/>
+          <w:szCs w:val="28"/>
+          <w:lang w:val="en-US"/>
+        </w:rPr>
+      </w:pPr>
+      <w:r>
+        <w:rPr>
+          <w:rFonts w:hint="default" w:ascii="Times New Roman" w:hAnsi="Times New Roman" w:cs="Times New Roman"/>
           <w:lang w:val="en-US"/>
         </w:rPr>
         <w:fldChar w:fldCharType="begin"/>
       </w:r>
       <w:r>
         <w:rPr>
-          <w:rFonts w:hint="default"/>
+          <w:rFonts w:hint="default" w:ascii="Times New Roman" w:hAnsi="Times New Roman" w:cs="Times New Roman"/>
           <w:lang w:val="en-US"/>
         </w:rPr>
         <w:instrText xml:space="preserve">TOC \o "1-3" \h \u </w:instrText>
       </w:r>
       <w:r>
         <w:rPr>
-          <w:rFonts w:hint="default"/>
+          <w:rFonts w:hint="default" w:ascii="Times New Roman" w:hAnsi="Times New Roman" w:cs="Times New Roman"/>
           <w:lang w:val="en-US"/>
         </w:rPr>
         <w:fldChar w:fldCharType="separate"/>
       </w:r>
       <w:r>
         <w:rPr>
-          <w:rFonts w:hint="default"/>
+          <w:rFonts w:hint="default" w:ascii="Times New Roman" w:hAnsi="Times New Roman" w:cs="Times New Roman"/>
           <w:sz w:val="28"/>
           <w:szCs w:val="28"/>
           <w:lang w:val="en-US"/>
@@ -1379,7 +1380,7 @@
       </w:r>
       <w:r>
         <w:rPr>
-          <w:rFonts w:hint="default"/>
+          <w:rFonts w:hint="default" w:ascii="Times New Roman" w:hAnsi="Times New Roman" w:cs="Times New Roman"/>
           <w:sz w:val="28"/>
           <w:szCs w:val="28"/>
           <w:lang w:val="en-US"/>
@@ -1388,7 +1389,7 @@
       </w:r>
       <w:r>
         <w:rPr>
-          <w:rFonts w:hint="default"/>
+          <w:rFonts w:hint="default" w:ascii="Times New Roman" w:hAnsi="Times New Roman" w:cs="Times New Roman"/>
           <w:sz w:val="28"/>
           <w:szCs w:val="28"/>
           <w:lang w:val="en-US"/>
@@ -1406,6 +1407,7 @@
       </w:r>
       <w:r>
         <w:rPr>
+          <w:rFonts w:hint="default" w:ascii="Times New Roman" w:hAnsi="Times New Roman" w:cs="Times New Roman"/>
           <w:sz w:val="28"/>
           <w:szCs w:val="28"/>
         </w:rPr>
@@ -1413,7 +1415,7 @@
       </w:r>
       <w:r>
         <w:rPr>
-          <w:rFonts w:hint="default"/>
+          <w:rFonts w:hint="default" w:ascii="Times New Roman" w:hAnsi="Times New Roman" w:cs="Times New Roman"/>
           <w:sz w:val="28"/>
           <w:szCs w:val="28"/>
           <w:lang w:val="en-US"/>
@@ -1422,7 +1424,7 @@
       </w:r>
       <w:r>
         <w:rPr>
-          <w:rFonts w:hint="default"/>
+          <w:rFonts w:hint="default" w:ascii="Times New Roman" w:hAnsi="Times New Roman" w:cs="Times New Roman"/>
           <w:sz w:val="28"/>
           <w:szCs w:val="28"/>
           <w:lang w:val="en-US"/>
@@ -1438,15 +1440,15 @@
         </w:tabs>
         <w:ind w:left="400" w:leftChars="100" w:firstLine="0" w:firstLineChars="0"/>
         <w:rPr>
-          <w:rFonts w:hint="default"/>
-          <w:sz w:val="28"/>
-          <w:szCs w:val="28"/>
-          <w:lang w:val="en-US"/>
-        </w:rPr>
-      </w:pPr>
-      <w:r>
-        <w:rPr>
-          <w:rFonts w:hint="default"/>
+          <w:rFonts w:hint="default" w:ascii="Times New Roman" w:hAnsi="Times New Roman" w:cs="Times New Roman"/>
+          <w:sz w:val="28"/>
+          <w:szCs w:val="28"/>
+          <w:lang w:val="en-US"/>
+        </w:rPr>
+      </w:pPr>
+      <w:r>
+        <w:rPr>
+          <w:rFonts w:hint="default" w:ascii="Times New Roman" w:hAnsi="Times New Roman" w:cs="Times New Roman"/>
           <w:sz w:val="28"/>
           <w:szCs w:val="28"/>
           <w:lang w:val="en-US"/>
@@ -1455,7 +1457,7 @@
       </w:r>
       <w:r>
         <w:rPr>
-          <w:rFonts w:hint="default"/>
+          <w:rFonts w:hint="default" w:ascii="Times New Roman" w:hAnsi="Times New Roman" w:cs="Times New Roman"/>
           <w:sz w:val="28"/>
           <w:szCs w:val="28"/>
           <w:lang w:val="en-US"/>
@@ -1464,7 +1466,7 @@
       </w:r>
       <w:r>
         <w:rPr>
-          <w:rFonts w:hint="default"/>
+          <w:rFonts w:hint="default" w:ascii="Times New Roman" w:hAnsi="Times New Roman" w:cs="Times New Roman"/>
           <w:sz w:val="28"/>
           <w:szCs w:val="28"/>
           <w:lang w:val="en-US"/>
@@ -1473,7 +1475,7 @@
       </w:r>
       <w:r>
         <w:rPr>
-          <w:rFonts w:hint="default"/>
+          <w:rFonts w:hint="default" w:ascii="Times New Roman" w:hAnsi="Times New Roman" w:cs="Times New Roman"/>
           <w:sz w:val="28"/>
           <w:szCs w:val="28"/>
           <w:lang w:val="en-US"/>
@@ -1491,7 +1493,7 @@
       </w:r>
       <w:r>
         <w:rPr>
-          <w:rFonts w:hint="default" w:cs="Times New Roman"/>
+          <w:rFonts w:hint="default" w:ascii="Times New Roman" w:hAnsi="Times New Roman" w:cs="Times New Roman"/>
           <w:sz w:val="28"/>
           <w:szCs w:val="28"/>
           <w:lang w:val="en-US"/>
@@ -1500,6 +1502,7 @@
       </w:r>
       <w:r>
         <w:rPr>
+          <w:rFonts w:hint="default" w:ascii="Times New Roman" w:hAnsi="Times New Roman" w:cs="Times New Roman"/>
           <w:sz w:val="28"/>
           <w:szCs w:val="28"/>
         </w:rPr>
@@ -1507,7 +1510,7 @@
       </w:r>
       <w:r>
         <w:rPr>
-          <w:rFonts w:hint="default"/>
+          <w:rFonts w:hint="default" w:ascii="Times New Roman" w:hAnsi="Times New Roman" w:cs="Times New Roman"/>
           <w:sz w:val="28"/>
           <w:szCs w:val="28"/>
           <w:lang w:val="en-US"/>
@@ -1516,7 +1519,7 @@
       </w:r>
       <w:r>
         <w:rPr>
-          <w:rFonts w:hint="default"/>
+          <w:rFonts w:hint="default" w:ascii="Times New Roman" w:hAnsi="Times New Roman" w:cs="Times New Roman"/>
           <w:sz w:val="28"/>
           <w:szCs w:val="28"/>
           <w:lang w:val="en-US"/>
@@ -1532,15 +1535,15 @@
         </w:tabs>
         <w:ind w:left="400" w:leftChars="100" w:firstLine="0" w:firstLineChars="0"/>
         <w:rPr>
-          <w:rFonts w:hint="default"/>
-          <w:sz w:val="28"/>
-          <w:szCs w:val="28"/>
-          <w:lang w:val="en-US"/>
-        </w:rPr>
-      </w:pPr>
-      <w:r>
-        <w:rPr>
-          <w:rFonts w:hint="default"/>
+          <w:rFonts w:hint="default" w:ascii="Times New Roman" w:hAnsi="Times New Roman" w:cs="Times New Roman"/>
+          <w:sz w:val="28"/>
+          <w:szCs w:val="28"/>
+          <w:lang w:val="en-US"/>
+        </w:rPr>
+      </w:pPr>
+      <w:r>
+        <w:rPr>
+          <w:rFonts w:hint="default" w:ascii="Times New Roman" w:hAnsi="Times New Roman" w:cs="Times New Roman"/>
           <w:sz w:val="28"/>
           <w:szCs w:val="28"/>
           <w:lang w:val="en-US"/>
@@ -1549,7 +1552,7 @@
       </w:r>
       <w:r>
         <w:rPr>
-          <w:rFonts w:hint="default"/>
+          <w:rFonts w:hint="default" w:ascii="Times New Roman" w:hAnsi="Times New Roman" w:cs="Times New Roman"/>
           <w:sz w:val="28"/>
           <w:szCs w:val="28"/>
           <w:lang w:val="en-US"/>
@@ -1558,7 +1561,7 @@
       </w:r>
       <w:r>
         <w:rPr>
-          <w:rFonts w:hint="default"/>
+          <w:rFonts w:hint="default" w:ascii="Times New Roman" w:hAnsi="Times New Roman" w:cs="Times New Roman"/>
           <w:sz w:val="28"/>
           <w:szCs w:val="28"/>
           <w:lang w:val="en-US"/>
@@ -1567,7 +1570,7 @@
       </w:r>
       <w:r>
         <w:rPr>
-          <w:rFonts w:hint="default"/>
+          <w:rFonts w:hint="default" w:ascii="Times New Roman" w:hAnsi="Times New Roman" w:cs="Times New Roman"/>
           <w:sz w:val="28"/>
           <w:szCs w:val="28"/>
           <w:lang w:val="en-US"/>
@@ -1585,7 +1588,7 @@
       </w:r>
       <w:r>
         <w:rPr>
-          <w:rFonts w:hint="default" w:cs="Times New Roman"/>
+          <w:rFonts w:hint="default" w:ascii="Times New Roman" w:hAnsi="Times New Roman" w:cs="Times New Roman"/>
           <w:sz w:val="28"/>
           <w:szCs w:val="28"/>
           <w:lang w:val="en-US"/>
@@ -1603,7 +1606,7 @@
       </w:r>
       <w:r>
         <w:rPr>
-          <w:rFonts w:hint="default" w:cs="Times New Roman"/>
+          <w:rFonts w:hint="default" w:ascii="Times New Roman" w:hAnsi="Times New Roman" w:cs="Times New Roman"/>
           <w:sz w:val="28"/>
           <w:szCs w:val="28"/>
           <w:lang w:val="en-US"/>
@@ -1612,6 +1615,7 @@
       </w:r>
       <w:r>
         <w:rPr>
+          <w:rFonts w:hint="default" w:ascii="Times New Roman" w:hAnsi="Times New Roman" w:cs="Times New Roman"/>
           <w:sz w:val="28"/>
           <w:szCs w:val="28"/>
         </w:rPr>
@@ -1619,7 +1623,7 @@
       </w:r>
       <w:r>
         <w:rPr>
-          <w:rFonts w:hint="default"/>
+          <w:rFonts w:hint="default" w:ascii="Times New Roman" w:hAnsi="Times New Roman" w:cs="Times New Roman"/>
           <w:sz w:val="28"/>
           <w:szCs w:val="28"/>
           <w:lang w:val="en-US"/>
@@ -1628,7 +1632,7 @@
       </w:r>
       <w:r>
         <w:rPr>
-          <w:rFonts w:hint="default"/>
+          <w:rFonts w:hint="default" w:ascii="Times New Roman" w:hAnsi="Times New Roman" w:cs="Times New Roman"/>
           <w:sz w:val="28"/>
           <w:szCs w:val="28"/>
           <w:lang w:val="en-US"/>
@@ -1644,15 +1648,15 @@
         </w:tabs>
         <w:ind w:left="400" w:leftChars="100" w:firstLine="0" w:firstLineChars="0"/>
         <w:rPr>
-          <w:rFonts w:hint="default"/>
-          <w:sz w:val="28"/>
-          <w:szCs w:val="28"/>
-          <w:lang w:val="en-US"/>
-        </w:rPr>
-      </w:pPr>
-      <w:r>
-        <w:rPr>
-          <w:rFonts w:hint="default"/>
+          <w:rFonts w:hint="default" w:ascii="Times New Roman" w:hAnsi="Times New Roman" w:cs="Times New Roman"/>
+          <w:sz w:val="28"/>
+          <w:szCs w:val="28"/>
+          <w:lang w:val="en-US"/>
+        </w:rPr>
+      </w:pPr>
+      <w:r>
+        <w:rPr>
+          <w:rFonts w:hint="default" w:ascii="Times New Roman" w:hAnsi="Times New Roman" w:cs="Times New Roman"/>
           <w:sz w:val="28"/>
           <w:szCs w:val="28"/>
           <w:lang w:val="en-US"/>
@@ -1661,7 +1665,7 @@
       </w:r>
       <w:r>
         <w:rPr>
-          <w:rFonts w:hint="default"/>
+          <w:rFonts w:hint="default" w:ascii="Times New Roman" w:hAnsi="Times New Roman" w:cs="Times New Roman"/>
           <w:sz w:val="28"/>
           <w:szCs w:val="28"/>
           <w:lang w:val="en-US"/>
@@ -1670,7 +1674,7 @@
       </w:r>
       <w:r>
         <w:rPr>
-          <w:rFonts w:hint="default"/>
+          <w:rFonts w:hint="default" w:ascii="Times New Roman" w:hAnsi="Times New Roman" w:cs="Times New Roman"/>
           <w:sz w:val="28"/>
           <w:szCs w:val="28"/>
           <w:lang w:val="en-US"/>
@@ -1679,7 +1683,7 @@
       </w:r>
       <w:r>
         <w:rPr>
-          <w:rFonts w:hint="default"/>
+          <w:rFonts w:hint="default" w:ascii="Times New Roman" w:hAnsi="Times New Roman" w:cs="Times New Roman"/>
           <w:sz w:val="28"/>
           <w:szCs w:val="28"/>
           <w:lang w:val="en-US"/>
@@ -1697,7 +1701,7 @@
       </w:r>
       <w:r>
         <w:rPr>
-          <w:rFonts w:hint="default" w:cs="Times New Roman"/>
+          <w:rFonts w:hint="default" w:ascii="Times New Roman" w:hAnsi="Times New Roman" w:cs="Times New Roman"/>
           <w:sz w:val="28"/>
           <w:szCs w:val="28"/>
           <w:lang w:val="en-US"/>
@@ -1715,7 +1719,7 @@
       </w:r>
       <w:r>
         <w:rPr>
-          <w:rFonts w:hint="default" w:cs="Times New Roman"/>
+          <w:rFonts w:hint="default" w:ascii="Times New Roman" w:hAnsi="Times New Roman" w:cs="Times New Roman"/>
           <w:sz w:val="28"/>
           <w:szCs w:val="28"/>
           <w:lang w:val="en-US"/>
@@ -1724,6 +1728,7 @@
       </w:r>
       <w:r>
         <w:rPr>
+          <w:rFonts w:hint="default" w:ascii="Times New Roman" w:hAnsi="Times New Roman" w:cs="Times New Roman"/>
           <w:sz w:val="28"/>
           <w:szCs w:val="28"/>
         </w:rPr>
@@ -1731,7 +1736,7 @@
       </w:r>
       <w:r>
         <w:rPr>
-          <w:rFonts w:hint="default"/>
+          <w:rFonts w:hint="default" w:ascii="Times New Roman" w:hAnsi="Times New Roman" w:cs="Times New Roman"/>
           <w:sz w:val="28"/>
           <w:szCs w:val="28"/>
           <w:lang w:val="en-US"/>
@@ -1740,7 +1745,7 @@
       </w:r>
       <w:r>
         <w:rPr>
-          <w:rFonts w:hint="default"/>
+          <w:rFonts w:hint="default" w:ascii="Times New Roman" w:hAnsi="Times New Roman" w:cs="Times New Roman"/>
           <w:sz w:val="28"/>
           <w:szCs w:val="28"/>
           <w:lang w:val="en-US"/>
@@ -1756,7 +1761,7 @@
         </w:tabs>
         <w:ind w:left="0" w:leftChars="0" w:firstLine="140" w:firstLineChars="50"/>
         <w:rPr>
-          <w:rFonts w:hint="default"/>
+          <w:rFonts w:hint="default" w:ascii="Times New Roman" w:hAnsi="Times New Roman" w:cs="Times New Roman"/>
           <w:sz w:val="28"/>
           <w:szCs w:val="28"/>
           <w:lang w:val="en-US"/>
@@ -1771,7 +1776,7 @@
         </w:tabs>
         <w:ind w:left="0" w:leftChars="0" w:firstLine="140" w:firstLineChars="50"/>
         <w:rPr>
-          <w:rFonts w:hint="default"/>
+          <w:rFonts w:hint="default" w:ascii="Times New Roman" w:hAnsi="Times New Roman" w:cs="Times New Roman"/>
           <w:sz w:val="28"/>
           <w:szCs w:val="28"/>
           <w:lang w:val="en-US"/>
@@ -1784,13 +1789,13 @@
         <w:bidi w:val="0"/>
         <w:ind w:left="0" w:leftChars="0" w:firstLine="0" w:firstLineChars="0"/>
         <w:rPr>
-          <w:rFonts w:hint="default"/>
-          <w:lang w:val="en-US"/>
-        </w:rPr>
-      </w:pPr>
-      <w:r>
-        <w:rPr>
-          <w:rFonts w:hint="default"/>
+          <w:rFonts w:hint="default" w:ascii="Times New Roman" w:hAnsi="Times New Roman" w:cs="Times New Roman"/>
+          <w:lang w:val="en-US"/>
+        </w:rPr>
+      </w:pPr>
+      <w:r>
+        <w:rPr>
+          <w:rFonts w:hint="default" w:ascii="Times New Roman" w:hAnsi="Times New Roman" w:cs="Times New Roman"/>
           <w:lang w:val="en-US"/>
         </w:rPr>
         <w:fldChar w:fldCharType="end"/>
@@ -1802,7 +1807,7 @@
         <w:bidi w:val="0"/>
         <w:ind w:left="0" w:leftChars="0" w:firstLine="0" w:firstLineChars="0"/>
         <w:rPr>
-          <w:rFonts w:hint="default"/>
+          <w:rFonts w:hint="default" w:ascii="Times New Roman" w:hAnsi="Times New Roman" w:cs="Times New Roman"/>
           <w:lang w:val="en-US"/>
         </w:rPr>
       </w:pPr>
@@ -1882,20 +1887,169 @@
       <w:pPr>
         <w:pStyle w:val="2"/>
         <w:bidi w:val="0"/>
-        <w:rPr>
-          <w:rFonts w:hint="default"/>
+        <w:spacing w:line="240" w:lineRule="auto"/>
+        <w:rPr>
+          <w:rFonts w:hint="default" w:ascii="Times New Roman" w:hAnsi="Times New Roman" w:cs="Times New Roman"/>
           <w:lang w:val="en-US"/>
         </w:rPr>
       </w:pPr>
       <w:bookmarkStart w:id="0" w:name="_Toc4876"/>
       <w:r>
         <w:rPr>
-          <w:rFonts w:hint="default"/>
+          <w:rFonts w:hint="default" w:ascii="Times New Roman" w:hAnsi="Times New Roman" w:cs="Times New Roman"/>
           <w:lang w:val="en-US"/>
         </w:rPr>
         <w:t>Part A: Introduction</w:t>
       </w:r>
       <w:bookmarkEnd w:id="0"/>
+    </w:p>
+    <w:p>
+      <w:pPr>
+        <w:pStyle w:val="3"/>
+        <w:bidi w:val="0"/>
+        <w:spacing w:line="240" w:lineRule="auto"/>
+        <w:ind w:left="400" w:leftChars="100" w:firstLine="0" w:firstLineChars="0"/>
+        <w:rPr>
+          <w:rFonts w:hint="default" w:ascii="Times New Roman" w:hAnsi="Times New Roman" w:cs="Times New Roman"/>
+          <w:sz w:val="25"/>
+          <w:szCs w:val="25"/>
+          <w:lang w:val="en-US"/>
+        </w:rPr>
+      </w:pPr>
+      <w:r>
+        <w:rPr>
+          <w:rFonts w:hint="default" w:ascii="Times New Roman" w:hAnsi="Times New Roman" w:cs="Times New Roman"/>
+          <w:lang w:val="en-US"/>
+        </w:rPr>
+        <w:t xml:space="preserve">1.1 Context and Background </w:t>
+      </w:r>
+    </w:p>
+    <w:p>
+      <w:pPr>
+        <w:keepNext w:val="0"/>
+        <w:keepLines w:val="0"/>
+        <w:widowControl/>
+        <w:suppressLineNumbers w:val="0"/>
+        <w:ind w:left="400" w:leftChars="100" w:firstLine="0" w:firstLineChars="0"/>
+        <w:jc w:val="both"/>
+        <w:rPr>
+          <w:rFonts w:hint="default" w:ascii="Times New Roman" w:hAnsi="Times New Roman" w:eastAsia="SimSun" w:cs="Times New Roman"/>
+          <w:b w:val="0"/>
+          <w:bCs w:val="0"/>
+          <w:kern w:val="0"/>
+          <w:sz w:val="24"/>
+          <w:szCs w:val="24"/>
+          <w:lang w:val="en-US" w:eastAsia="zh-CN" w:bidi="ar"/>
+        </w:rPr>
+      </w:pPr>
+      <w:r>
+        <w:rPr>
+          <w:rFonts w:hint="default" w:ascii="Times New Roman" w:hAnsi="Times New Roman" w:eastAsia="sans-serif" w:cs="Times New Roman"/>
+          <w:b w:val="0"/>
+          <w:bCs w:val="0"/>
+          <w:kern w:val="0"/>
+          <w:sz w:val="24"/>
+          <w:szCs w:val="24"/>
+          <w:lang w:val="en-US" w:eastAsia="zh-CN" w:bidi="ar"/>
+        </w:rPr>
+        <w:t>While the first assignment required the development of a comprehensive Software Requirements Specification (SRS) document using the Tasks and Support technique to expand the business operations of ABC-Trans Company, the second report shifts the focus to establishing a high-level object-oriented design for the centralized Smart Fleet Management System (SmartFM). Therefore, the company faces the following issues including operational bottlenecks, customer dissatisfaction, and restricted organizational scalability due to fragmented, manual processes across vehicle allocation, driver tracking, order processing, and branch-specific workflows. Consequently, the SmartFM system integrates in-branch, web, and mobile applications into a unified platform that optimizes resource scheduling, provides real-time shipment visibility, and aggregates comprehensive utilization statistics.</w:t>
+      </w:r>
+      <w:r>
+        <w:rPr>
+          <w:rFonts w:hint="default" w:ascii="Times New Roman" w:hAnsi="Times New Roman" w:eastAsia="SimSun" w:cs="Times New Roman"/>
+          <w:b w:val="0"/>
+          <w:bCs w:val="0"/>
+          <w:kern w:val="0"/>
+          <w:sz w:val="24"/>
+          <w:szCs w:val="24"/>
+          <w:lang w:val="en-US" w:eastAsia="zh-CN" w:bidi="ar"/>
+        </w:rPr>
+        <w:t xml:space="preserve"> </w:t>
+      </w:r>
+    </w:p>
+    <w:p>
+      <w:pPr>
+        <w:keepNext w:val="0"/>
+        <w:keepLines w:val="0"/>
+        <w:widowControl/>
+        <w:suppressLineNumbers w:val="0"/>
+        <w:ind w:left="400" w:leftChars="100" w:firstLine="0" w:firstLineChars="0"/>
+        <w:jc w:val="both"/>
+        <w:rPr>
+          <w:rFonts w:hint="default" w:ascii="Times New Roman" w:hAnsi="Times New Roman" w:eastAsia="SimSun" w:cs="Times New Roman"/>
+          <w:b w:val="0"/>
+          <w:bCs w:val="0"/>
+          <w:kern w:val="0"/>
+          <w:sz w:val="24"/>
+          <w:szCs w:val="24"/>
+          <w:lang w:val="en-US" w:eastAsia="zh-CN" w:bidi="ar"/>
+        </w:rPr>
+      </w:pPr>
+    </w:p>
+    <w:p>
+      <w:pPr>
+        <w:keepNext w:val="0"/>
+        <w:keepLines w:val="0"/>
+        <w:widowControl/>
+        <w:suppressLineNumbers w:val="0"/>
+        <w:ind w:left="400" w:leftChars="100" w:firstLine="0" w:firstLineChars="0"/>
+        <w:jc w:val="both"/>
+        <w:rPr>
+          <w:rFonts w:hint="default" w:ascii="Times New Roman" w:hAnsi="Times New Roman" w:cs="Times New Roman"/>
+        </w:rPr>
+      </w:pPr>
+      <w:r>
+        <w:rPr>
+          <w:rFonts w:hint="default" w:ascii="Times New Roman" w:hAnsi="Times New Roman" w:eastAsia="sans-serif" w:cs="Times New Roman"/>
+          <w:kern w:val="0"/>
+          <w:sz w:val="24"/>
+          <w:szCs w:val="24"/>
+          <w:lang w:val="en-US" w:eastAsia="zh-CN" w:bidi="ar"/>
+        </w:rPr>
+        <w:t>In detail, the document emphasizes the initial object-oriented system design for the platform by utilizing the Responsibility-Driven Design (RDD) framework</w:t>
+      </w:r>
+      <w:r>
+        <w:rPr>
+          <w:rFonts w:hint="default" w:ascii="Times New Roman" w:hAnsi="Times New Roman" w:eastAsia="sans-serif" w:cs="Times New Roman"/>
+          <w:kern w:val="0"/>
+          <w:sz w:val="24"/>
+          <w:szCs w:val="24"/>
+          <w:lang w:val="en-US" w:eastAsia="zh-CN" w:bidi="ar"/>
+        </w:rPr>
+        <w:t xml:space="preserve">. Furthermore, the design maps project requirements and logistics workflows into a clean taxonomy of structural classes, data-holders, and dynamic </w:t>
+      </w:r>
+      <w:r>
+        <w:rPr>
+          <w:rFonts w:hint="default" w:ascii="Times New Roman" w:hAnsi="Times New Roman" w:eastAsia="sans-serif" w:cs="Times New Roman"/>
+          <w:b/>
+          <w:bCs/>
+          <w:kern w:val="0"/>
+          <w:sz w:val="24"/>
+          <w:szCs w:val="24"/>
+          <w:lang w:val="en-US" w:eastAsia="zh-CN" w:bidi="ar"/>
+        </w:rPr>
+        <w:t>controllers</w:t>
+      </w:r>
+      <w:r>
+        <w:rPr>
+          <w:rFonts w:hint="default" w:ascii="Times New Roman" w:hAnsi="Times New Roman" w:eastAsia="sans-serif" w:cs="Times New Roman"/>
+          <w:kern w:val="0"/>
+          <w:sz w:val="24"/>
+          <w:szCs w:val="24"/>
+          <w:lang w:val="en-US" w:eastAsia="zh-CN" w:bidi="ar"/>
+        </w:rPr>
+        <w:t xml:space="preserve"> based on behavioral obligations and object collaborations over premature data structures. Additionally, foundational design patterns and heuristics are integrated to enforce the Open-Closed Principle, delivering a decoupled blueprint that minimizes technical debt and secures a stable foundation for downstream system implementation.</w:t>
+      </w:r>
+      <w:r>
+        <w:rPr>
+          <w:rFonts w:hint="default" w:ascii="Times New Roman" w:hAnsi="Times New Roman" w:eastAsia="SimSun" w:cs="Times New Roman"/>
+          <w:kern w:val="0"/>
+          <w:sz w:val="24"/>
+          <w:szCs w:val="24"/>
+          <w:lang w:val="en-US" w:eastAsia="zh-CN" w:bidi="ar"/>
+        </w:rPr>
+        <w:t xml:space="preserve"> </w:t>
+      </w:r>
     </w:p>
     <w:p>
       <w:pPr>
@@ -1903,6 +2057,7 @@
           <w:ilvl w:val="0"/>
           <w:numId w:val="0"/>
         </w:numPr>
+        <w:spacing w:line="240" w:lineRule="auto"/>
         <w:jc w:val="both"/>
         <w:rPr>
           <w:rFonts w:hint="default" w:ascii="Times New Roman" w:hAnsi="Times New Roman" w:cs="Times New Roman"/>
@@ -1919,6 +2074,7 @@
           <w:ilvl w:val="0"/>
           <w:numId w:val="0"/>
         </w:numPr>
+        <w:spacing w:line="240" w:lineRule="auto"/>
         <w:jc w:val="both"/>
         <w:rPr>
           <w:rFonts w:hint="default" w:ascii="Times New Roman" w:hAnsi="Times New Roman" w:cs="Times New Roman"/>
@@ -1931,22 +2087,7 @@
     </w:p>
     <w:p>
       <w:pPr>
-        <w:numPr>
-          <w:ilvl w:val="0"/>
-          <w:numId w:val="0"/>
-        </w:numPr>
-        <w:jc w:val="both"/>
-        <w:rPr>
-          <w:rFonts w:hint="default" w:ascii="Times New Roman" w:hAnsi="Times New Roman" w:cs="Times New Roman"/>
-          <w:b w:val="0"/>
-          <w:bCs w:val="0"/>
-          <w:sz w:val="24"/>
-          <w:szCs w:val="24"/>
-        </w:rPr>
-      </w:pPr>
-    </w:p>
-    <w:p>
-      <w:pPr>
+        <w:spacing w:line="240" w:lineRule="auto"/>
         <w:rPr>
           <w:rFonts w:hint="default" w:ascii="Times New Roman" w:hAnsi="Times New Roman" w:cs="Times New Roman"/>
           <w:lang w:val="en-US"/>
@@ -2055,6 +2196,8 @@
         </w:rPr>
         <w:fldChar w:fldCharType="end"/>
       </w:r>
+      <w:bookmarkStart w:id="1" w:name="_GoBack"/>
+      <w:bookmarkEnd w:id="1"/>
     </w:p>
     <w:sectPr>
       <w:pgSz w:w="11906" w:h="16838"/>

</xml_diff>

<commit_message>
Finish Part 1.2 (Purpose and Architectural Scope) of second assignment.
</commit_message>
<xml_diff>
--- a/Assignments/Assignment2/Team Report.docx
+++ b/Assignments/Assignment2/Team Report.docx
@@ -771,34 +771,7 @@
           <w:szCs w:val="28"/>
           <w:lang w:val="en-US"/>
         </w:rPr>
-        <w:t xml:space="preserve">: </w:t>
-      </w:r>
-      <w:r>
-        <w:rPr>
-          <w:rFonts w:hint="default" w:ascii="Times New Roman" w:hAnsi="Times New Roman" w:cs="Times New Roman"/>
-          <w:sz w:val="28"/>
-          <w:szCs w:val="28"/>
-          <w:lang w:val="en-US"/>
-        </w:rPr>
-        <w:t>June</w:t>
-      </w:r>
-      <w:r>
-        <w:rPr>
-          <w:rFonts w:hint="default" w:ascii="Times New Roman" w:hAnsi="Times New Roman" w:cs="Times New Roman"/>
-          <w:sz w:val="28"/>
-          <w:szCs w:val="28"/>
-          <w:lang w:val="en-US"/>
-        </w:rPr>
-        <w:t xml:space="preserve"> </w:t>
-      </w:r>
-      <w:r>
-        <w:rPr>
-          <w:rFonts w:hint="default" w:ascii="Times New Roman" w:hAnsi="Times New Roman" w:cs="Times New Roman"/>
-          <w:sz w:val="28"/>
-          <w:szCs w:val="28"/>
-          <w:lang w:val="en-US"/>
-        </w:rPr>
-        <w:t>27</w:t>
+        <w:t>: June 27</w:t>
       </w:r>
       <w:r>
         <w:rPr>
@@ -914,25 +887,7 @@
           <w:szCs w:val="28"/>
           <w:lang w:val="en-US"/>
         </w:rPr>
-        <w:t xml:space="preserve">: </w:t>
-      </w:r>
-      <w:r>
-        <w:rPr>
-          <w:rFonts w:hint="default" w:ascii="Times New Roman" w:hAnsi="Times New Roman" w:cs="Times New Roman"/>
-          <w:sz w:val="28"/>
-          <w:szCs w:val="28"/>
-          <w:lang w:val="en-US"/>
-        </w:rPr>
-        <w:t xml:space="preserve"> </w:t>
-      </w:r>
-      <w:r>
-        <w:rPr>
-          <w:rFonts w:hint="default" w:ascii="Times New Roman" w:hAnsi="Times New Roman" w:cs="Times New Roman"/>
-          <w:sz w:val="28"/>
-          <w:szCs w:val="28"/>
-          <w:lang w:val="en-US"/>
-        </w:rPr>
-        <w:t>words</w:t>
+        <w:t>:  words</w:t>
       </w:r>
     </w:p>
     <w:p>
@@ -1343,8 +1298,8 @@
         <w:ind w:left="0" w:leftChars="0" w:firstLine="0" w:firstLineChars="0"/>
         <w:rPr>
           <w:rFonts w:hint="default" w:ascii="Times New Roman" w:hAnsi="Times New Roman" w:cs="Times New Roman"/>
-          <w:sz w:val="28"/>
-          <w:szCs w:val="28"/>
+          <w:sz w:val="32"/>
+          <w:szCs w:val="32"/>
           <w:lang w:val="en-US"/>
         </w:rPr>
       </w:pPr>
@@ -1372,8 +1327,8 @@
       <w:r>
         <w:rPr>
           <w:rFonts w:hint="default" w:ascii="Times New Roman" w:hAnsi="Times New Roman" w:cs="Times New Roman"/>
-          <w:sz w:val="28"/>
-          <w:szCs w:val="28"/>
+          <w:sz w:val="32"/>
+          <w:szCs w:val="32"/>
           <w:lang w:val="en-US"/>
         </w:rPr>
         <w:fldChar w:fldCharType="begin"/>
@@ -1381,8 +1336,8 @@
       <w:r>
         <w:rPr>
           <w:rFonts w:hint="default" w:ascii="Times New Roman" w:hAnsi="Times New Roman" w:cs="Times New Roman"/>
-          <w:sz w:val="28"/>
-          <w:szCs w:val="28"/>
+          <w:sz w:val="32"/>
+          <w:szCs w:val="32"/>
           <w:lang w:val="en-US"/>
         </w:rPr>
         <w:instrText xml:space="preserve"> HYPERLINK \l _Toc4876 </w:instrText>
@@ -1390,8 +1345,8 @@
       <w:r>
         <w:rPr>
           <w:rFonts w:hint="default" w:ascii="Times New Roman" w:hAnsi="Times New Roman" w:cs="Times New Roman"/>
-          <w:sz w:val="28"/>
-          <w:szCs w:val="28"/>
+          <w:sz w:val="32"/>
+          <w:szCs w:val="32"/>
           <w:lang w:val="en-US"/>
         </w:rPr>
         <w:fldChar w:fldCharType="separate"/>
@@ -1399,8 +1354,8 @@
       <w:r>
         <w:rPr>
           <w:rFonts w:hint="default" w:ascii="Times New Roman" w:hAnsi="Times New Roman" w:cs="Times New Roman"/>
-          <w:sz w:val="28"/>
-          <w:szCs w:val="28"/>
+          <w:sz w:val="32"/>
+          <w:szCs w:val="32"/>
           <w:lang w:val="en-US"/>
         </w:rPr>
         <w:t>Part A: Introduction</w:t>
@@ -1408,16 +1363,16 @@
       <w:r>
         <w:rPr>
           <w:rFonts w:hint="default" w:ascii="Times New Roman" w:hAnsi="Times New Roman" w:cs="Times New Roman"/>
-          <w:sz w:val="28"/>
-          <w:szCs w:val="28"/>
+          <w:sz w:val="32"/>
+          <w:szCs w:val="32"/>
         </w:rPr>
         <w:tab/>
       </w:r>
       <w:r>
         <w:rPr>
           <w:rFonts w:hint="default" w:ascii="Times New Roman" w:hAnsi="Times New Roman" w:cs="Times New Roman"/>
-          <w:sz w:val="28"/>
-          <w:szCs w:val="28"/>
+          <w:sz w:val="32"/>
+          <w:szCs w:val="32"/>
           <w:lang w:val="en-US"/>
         </w:rPr>
         <w:t>x</w:t>
@@ -1425,8 +1380,8 @@
       <w:r>
         <w:rPr>
           <w:rFonts w:hint="default" w:ascii="Times New Roman" w:hAnsi="Times New Roman" w:cs="Times New Roman"/>
-          <w:sz w:val="28"/>
-          <w:szCs w:val="28"/>
+          <w:sz w:val="32"/>
+          <w:szCs w:val="32"/>
           <w:lang w:val="en-US"/>
         </w:rPr>
         <w:fldChar w:fldCharType="end"/>
@@ -1480,25 +1435,7 @@
           <w:szCs w:val="28"/>
           <w:lang w:val="en-US"/>
         </w:rPr>
-        <w:t>1</w:t>
-      </w:r>
-      <w:r>
-        <w:rPr>
-          <w:rFonts w:hint="default" w:ascii="Times New Roman" w:hAnsi="Times New Roman" w:cs="Times New Roman"/>
-          <w:sz w:val="28"/>
-          <w:szCs w:val="28"/>
-          <w:lang w:val="en-US"/>
-        </w:rPr>
-        <w:t xml:space="preserve">.1 </w:t>
-      </w:r>
-      <w:r>
-        <w:rPr>
-          <w:rFonts w:hint="default" w:ascii="Times New Roman" w:hAnsi="Times New Roman" w:cs="Times New Roman"/>
-          <w:sz w:val="28"/>
-          <w:szCs w:val="28"/>
-          <w:lang w:val="en-US"/>
-        </w:rPr>
-        <w:t>Context and Background</w:t>
+        <w:t>1.1 Context and Background</w:t>
       </w:r>
       <w:r>
         <w:rPr>
@@ -1575,43 +1512,7 @@
           <w:szCs w:val="28"/>
           <w:lang w:val="en-US"/>
         </w:rPr>
-        <w:t>1</w:t>
-      </w:r>
-      <w:r>
-        <w:rPr>
-          <w:rFonts w:hint="default" w:ascii="Times New Roman" w:hAnsi="Times New Roman" w:cs="Times New Roman"/>
-          <w:sz w:val="28"/>
-          <w:szCs w:val="28"/>
-          <w:lang w:val="en-US"/>
-        </w:rPr>
-        <w:t>.</w:t>
-      </w:r>
-      <w:r>
-        <w:rPr>
-          <w:rFonts w:hint="default" w:ascii="Times New Roman" w:hAnsi="Times New Roman" w:cs="Times New Roman"/>
-          <w:sz w:val="28"/>
-          <w:szCs w:val="28"/>
-          <w:lang w:val="en-US"/>
-        </w:rPr>
-        <w:t>2</w:t>
-      </w:r>
-      <w:r>
-        <w:rPr>
-          <w:rFonts w:hint="default" w:ascii="Times New Roman" w:hAnsi="Times New Roman" w:cs="Times New Roman"/>
-          <w:sz w:val="28"/>
-          <w:szCs w:val="28"/>
-          <w:lang w:val="en-US"/>
-        </w:rPr>
-        <w:t xml:space="preserve"> </w:t>
-      </w:r>
-      <w:r>
-        <w:rPr>
-          <w:rFonts w:hint="default" w:ascii="Times New Roman" w:hAnsi="Times New Roman" w:cs="Times New Roman"/>
-          <w:sz w:val="28"/>
-          <w:szCs w:val="28"/>
-          <w:lang w:val="en-US"/>
-        </w:rPr>
-        <w:t>Purpose and Architectural Scope</w:t>
+        <w:t>1.2 Purpose and Architectural Scope</w:t>
       </w:r>
       <w:r>
         <w:rPr>
@@ -1688,57 +1589,125 @@
           <w:szCs w:val="28"/>
           <w:lang w:val="en-US"/>
         </w:rPr>
-        <w:t>1</w:t>
-      </w:r>
-      <w:r>
-        <w:rPr>
-          <w:rFonts w:hint="default" w:ascii="Times New Roman" w:hAnsi="Times New Roman" w:cs="Times New Roman"/>
-          <w:sz w:val="28"/>
-          <w:szCs w:val="28"/>
-          <w:lang w:val="en-US"/>
-        </w:rPr>
-        <w:t>.</w:t>
-      </w:r>
-      <w:r>
-        <w:rPr>
-          <w:rFonts w:hint="default" w:ascii="Times New Roman" w:hAnsi="Times New Roman" w:cs="Times New Roman"/>
-          <w:sz w:val="28"/>
-          <w:szCs w:val="28"/>
-          <w:lang w:val="en-US"/>
-        </w:rPr>
-        <w:t>3</w:t>
-      </w:r>
-      <w:r>
-        <w:rPr>
-          <w:rFonts w:hint="default" w:ascii="Times New Roman" w:hAnsi="Times New Roman" w:cs="Times New Roman"/>
-          <w:sz w:val="28"/>
-          <w:szCs w:val="28"/>
+        <w:t>1.3 System Architecture Roadmap</w:t>
+      </w:r>
+      <w:r>
+        <w:rPr>
+          <w:rFonts w:hint="default" w:ascii="Times New Roman" w:hAnsi="Times New Roman" w:cs="Times New Roman"/>
+          <w:sz w:val="28"/>
+          <w:szCs w:val="28"/>
+        </w:rPr>
+        <w:tab/>
+      </w:r>
+      <w:r>
+        <w:rPr>
+          <w:rFonts w:hint="default" w:ascii="Times New Roman" w:hAnsi="Times New Roman" w:cs="Times New Roman"/>
+          <w:sz w:val="28"/>
+          <w:szCs w:val="28"/>
+          <w:lang w:val="en-US"/>
+        </w:rPr>
+        <w:t>x</w:t>
+      </w:r>
+      <w:r>
+        <w:rPr>
+          <w:rFonts w:hint="default" w:ascii="Times New Roman" w:hAnsi="Times New Roman" w:cs="Times New Roman"/>
+          <w:sz w:val="28"/>
+          <w:szCs w:val="28"/>
+          <w:lang w:val="en-US"/>
+        </w:rPr>
+        <w:fldChar w:fldCharType="end"/>
+      </w:r>
+    </w:p>
+    <w:p>
+      <w:pPr>
+        <w:pStyle w:val="12"/>
+        <w:tabs>
+          <w:tab w:val="right" w:leader="dot" w:pos="8306"/>
+        </w:tabs>
+        <w:ind w:left="800" w:leftChars="200" w:firstLine="0" w:firstLineChars="0"/>
+        <w:rPr>
+          <w:rFonts w:hint="default" w:ascii="Times New Roman" w:hAnsi="Times New Roman" w:cs="Times New Roman"/>
+          <w:sz w:val="25"/>
+          <w:szCs w:val="25"/>
+          <w:lang w:val="en-US"/>
+        </w:rPr>
+      </w:pPr>
+      <w:r>
+        <w:rPr>
+          <w:rFonts w:hint="default" w:ascii="Times New Roman" w:hAnsi="Times New Roman" w:cs="Times New Roman"/>
+          <w:sz w:val="25"/>
+          <w:szCs w:val="25"/>
+          <w:lang w:val="en-US"/>
+        </w:rPr>
+        <w:fldChar w:fldCharType="begin"/>
+      </w:r>
+      <w:r>
+        <w:rPr>
+          <w:rFonts w:hint="default" w:ascii="Times New Roman" w:hAnsi="Times New Roman" w:cs="Times New Roman"/>
+          <w:sz w:val="25"/>
+          <w:szCs w:val="25"/>
+          <w:lang w:val="en-US"/>
+        </w:rPr>
+        <w:instrText xml:space="preserve"> HYPERLINK \l _Toc7289 </w:instrText>
+      </w:r>
+      <w:r>
+        <w:rPr>
+          <w:rFonts w:hint="default" w:ascii="Times New Roman" w:hAnsi="Times New Roman" w:cs="Times New Roman"/>
+          <w:sz w:val="25"/>
+          <w:szCs w:val="25"/>
+          <w:lang w:val="en-US"/>
+        </w:rPr>
+        <w:fldChar w:fldCharType="separate"/>
+      </w:r>
+      <w:r>
+        <w:rPr>
+          <w:rFonts w:hint="default" w:ascii="Times New Roman" w:hAnsi="Times New Roman" w:cs="Times New Roman"/>
+          <w:sz w:val="25"/>
+          <w:szCs w:val="25"/>
+          <w:lang w:val="en-US"/>
+        </w:rPr>
+        <w:t>1.</w:t>
+      </w:r>
+      <w:r>
+        <w:rPr>
+          <w:rFonts w:hint="default" w:cs="Times New Roman"/>
+          <w:sz w:val="25"/>
+          <w:szCs w:val="25"/>
+          <w:lang w:val="en-US"/>
+        </w:rPr>
+        <w:t>3.1</w:t>
+      </w:r>
+      <w:r>
+        <w:rPr>
+          <w:rFonts w:hint="default" w:ascii="Times New Roman" w:hAnsi="Times New Roman" w:cs="Times New Roman"/>
+          <w:sz w:val="25"/>
+          <w:szCs w:val="25"/>
           <w:lang w:val="en-US"/>
         </w:rPr>
         <w:t xml:space="preserve"> </w:t>
       </w:r>
       <w:r>
         <w:rPr>
-          <w:rFonts w:hint="default" w:ascii="Times New Roman" w:hAnsi="Times New Roman" w:cs="Times New Roman"/>
-          <w:sz w:val="28"/>
-          <w:szCs w:val="28"/>
-          <w:lang w:val="en-US"/>
-        </w:rPr>
-        <w:t>System Architecture Roadmap</w:t>
-      </w:r>
-      <w:r>
-        <w:rPr>
-          <w:rFonts w:hint="default" w:ascii="Times New Roman" w:hAnsi="Times New Roman" w:cs="Times New Roman"/>
-          <w:sz w:val="28"/>
-          <w:szCs w:val="28"/>
+          <w:rFonts w:hint="default" w:cs="Times New Roman"/>
+          <w:sz w:val="25"/>
+          <w:szCs w:val="25"/>
+          <w:lang w:val="en-US"/>
+        </w:rPr>
+        <w:t>In Scope</w:t>
+      </w:r>
+      <w:r>
+        <w:rPr>
+          <w:rFonts w:hint="default" w:ascii="Times New Roman" w:hAnsi="Times New Roman" w:cs="Times New Roman"/>
+          <w:sz w:val="25"/>
+          <w:szCs w:val="25"/>
         </w:rPr>
         <w:tab/>
       </w:r>
       <w:r>
         <w:rPr>
           <w:rFonts w:hint="default" w:ascii="Times New Roman" w:hAnsi="Times New Roman" w:cs="Times New Roman"/>
-          <w:sz w:val="28"/>
-          <w:szCs w:val="28"/>
+          <w:sz w:val="25"/>
+          <w:szCs w:val="25"/>
           <w:lang w:val="en-US"/>
         </w:rPr>
         <w:t>x</w:t>
@@ -1746,8 +1715,112 @@
       <w:r>
         <w:rPr>
           <w:rFonts w:hint="default" w:ascii="Times New Roman" w:hAnsi="Times New Roman" w:cs="Times New Roman"/>
-          <w:sz w:val="28"/>
-          <w:szCs w:val="28"/>
+          <w:sz w:val="25"/>
+          <w:szCs w:val="25"/>
+          <w:lang w:val="en-US"/>
+        </w:rPr>
+        <w:fldChar w:fldCharType="end"/>
+      </w:r>
+    </w:p>
+    <w:p>
+      <w:pPr>
+        <w:pStyle w:val="12"/>
+        <w:tabs>
+          <w:tab w:val="right" w:leader="dot" w:pos="8306"/>
+        </w:tabs>
+        <w:ind w:left="800" w:leftChars="200" w:firstLine="0" w:firstLineChars="0"/>
+        <w:rPr>
+          <w:rFonts w:hint="default" w:ascii="Times New Roman" w:hAnsi="Times New Roman" w:cs="Times New Roman"/>
+          <w:sz w:val="25"/>
+          <w:szCs w:val="25"/>
+          <w:lang w:val="en-US"/>
+        </w:rPr>
+      </w:pPr>
+      <w:r>
+        <w:rPr>
+          <w:rFonts w:hint="default" w:ascii="Times New Roman" w:hAnsi="Times New Roman" w:cs="Times New Roman"/>
+          <w:sz w:val="25"/>
+          <w:szCs w:val="25"/>
+          <w:lang w:val="en-US"/>
+        </w:rPr>
+        <w:fldChar w:fldCharType="begin"/>
+      </w:r>
+      <w:r>
+        <w:rPr>
+          <w:rFonts w:hint="default" w:ascii="Times New Roman" w:hAnsi="Times New Roman" w:cs="Times New Roman"/>
+          <w:sz w:val="25"/>
+          <w:szCs w:val="25"/>
+          <w:lang w:val="en-US"/>
+        </w:rPr>
+        <w:instrText xml:space="preserve"> HYPERLINK \l _Toc7289 </w:instrText>
+      </w:r>
+      <w:r>
+        <w:rPr>
+          <w:rFonts w:hint="default" w:ascii="Times New Roman" w:hAnsi="Times New Roman" w:cs="Times New Roman"/>
+          <w:sz w:val="25"/>
+          <w:szCs w:val="25"/>
+          <w:lang w:val="en-US"/>
+        </w:rPr>
+        <w:fldChar w:fldCharType="separate"/>
+      </w:r>
+      <w:r>
+        <w:rPr>
+          <w:rFonts w:hint="default" w:ascii="Times New Roman" w:hAnsi="Times New Roman" w:cs="Times New Roman"/>
+          <w:sz w:val="25"/>
+          <w:szCs w:val="25"/>
+          <w:lang w:val="en-US"/>
+        </w:rPr>
+        <w:t>1.</w:t>
+      </w:r>
+      <w:r>
+        <w:rPr>
+          <w:rFonts w:hint="default" w:cs="Times New Roman"/>
+          <w:sz w:val="25"/>
+          <w:szCs w:val="25"/>
+          <w:lang w:val="en-US"/>
+        </w:rPr>
+        <w:t>3.2</w:t>
+      </w:r>
+      <w:r>
+        <w:rPr>
+          <w:rFonts w:hint="default" w:ascii="Times New Roman" w:hAnsi="Times New Roman" w:cs="Times New Roman"/>
+          <w:sz w:val="25"/>
+          <w:szCs w:val="25"/>
+          <w:lang w:val="en-US"/>
+        </w:rPr>
+        <w:t xml:space="preserve"> </w:t>
+      </w:r>
+      <w:r>
+        <w:rPr>
+          <w:rFonts w:hint="default" w:cs="Times New Roman"/>
+          <w:sz w:val="25"/>
+          <w:szCs w:val="25"/>
+          <w:lang w:val="en-US"/>
+        </w:rPr>
+        <w:t>Out-of-Scope</w:t>
+      </w:r>
+      <w:r>
+        <w:rPr>
+          <w:rFonts w:hint="default" w:ascii="Times New Roman" w:hAnsi="Times New Roman" w:cs="Times New Roman"/>
+          <w:sz w:val="25"/>
+          <w:szCs w:val="25"/>
+        </w:rPr>
+        <w:tab/>
+      </w:r>
+      <w:r>
+        <w:rPr>
+          <w:rFonts w:hint="default" w:ascii="Times New Roman" w:hAnsi="Times New Roman" w:cs="Times New Roman"/>
+          <w:sz w:val="25"/>
+          <w:szCs w:val="25"/>
+          <w:lang w:val="en-US"/>
+        </w:rPr>
+        <w:t>x</w:t>
+      </w:r>
+      <w:r>
+        <w:rPr>
+          <w:rFonts w:hint="default" w:ascii="Times New Roman" w:hAnsi="Times New Roman" w:cs="Times New Roman"/>
+          <w:sz w:val="25"/>
+          <w:szCs w:val="25"/>
           <w:lang w:val="en-US"/>
         </w:rPr>
         <w:fldChar w:fldCharType="end"/>
@@ -1952,7 +2025,151 @@
           <w:szCs w:val="24"/>
           <w:lang w:val="en-US" w:eastAsia="zh-CN" w:bidi="ar"/>
         </w:rPr>
-        <w:t>While the first assignment required the development of a comprehensive Software Requirements Specification (SRS) document using the Tasks and Support technique to expand the business operations of ABC-Trans Company, the second report shifts the focus to establishing a high-level object-oriented design for the centralized Smart Fleet Management System (SmartFM). Therefore, the company faces the following issues including operational bottlenecks, customer dissatisfaction, and restricted organizational scalability due to fragmented, manual processes across vehicle allocation, driver tracking, order processing, and branch-specific workflows. Consequently, the SmartFM system integrates in-branch, web, and mobile applications into a unified platform that optimizes resource scheduling, provides real-time shipment visibility, and aggregates comprehensive utilization statistics.</w:t>
+        <w:t xml:space="preserve">While the first assignment required the development of a comprehensive Software Requirements Specification (SRS) document using the Tasks and Support technique to expand the business operations of ABC-Trans Company, the second report shifts the focus to establishing a high-level object-oriented design for the centralized Smart Fleet Management System (SmartFM). </w:t>
+      </w:r>
+      <w:r>
+        <w:rPr>
+          <w:rFonts w:hint="default" w:eastAsia="sans-serif" w:cs="Times New Roman"/>
+          <w:b w:val="0"/>
+          <w:bCs w:val="0"/>
+          <w:kern w:val="0"/>
+          <w:sz w:val="24"/>
+          <w:szCs w:val="24"/>
+          <w:lang w:val="en-US" w:eastAsia="zh-CN" w:bidi="ar"/>
+        </w:rPr>
+        <w:t>Based on the scenario</w:t>
+      </w:r>
+      <w:r>
+        <w:rPr>
+          <w:rFonts w:hint="default" w:ascii="Times New Roman" w:hAnsi="Times New Roman" w:eastAsia="sans-serif" w:cs="Times New Roman"/>
+          <w:b w:val="0"/>
+          <w:bCs w:val="0"/>
+          <w:kern w:val="0"/>
+          <w:sz w:val="24"/>
+          <w:szCs w:val="24"/>
+          <w:lang w:val="en-US" w:eastAsia="zh-CN" w:bidi="ar"/>
+        </w:rPr>
+        <w:t>, the company</w:t>
+      </w:r>
+      <w:r>
+        <w:rPr>
+          <w:rFonts w:hint="default" w:eastAsia="sans-serif" w:cs="Times New Roman"/>
+          <w:b w:val="0"/>
+          <w:bCs w:val="0"/>
+          <w:kern w:val="0"/>
+          <w:sz w:val="24"/>
+          <w:szCs w:val="24"/>
+          <w:lang w:val="en-US" w:eastAsia="zh-CN" w:bidi="ar"/>
+        </w:rPr>
+        <w:t xml:space="preserve"> faces</w:t>
+      </w:r>
+      <w:r>
+        <w:rPr>
+          <w:rFonts w:hint="default" w:ascii="Times New Roman" w:hAnsi="Times New Roman" w:eastAsia="sans-serif" w:cs="Times New Roman"/>
+          <w:b w:val="0"/>
+          <w:bCs w:val="0"/>
+          <w:kern w:val="0"/>
+          <w:sz w:val="24"/>
+          <w:szCs w:val="24"/>
+          <w:lang w:val="en-US" w:eastAsia="zh-CN" w:bidi="ar"/>
+        </w:rPr>
+        <w:t xml:space="preserve"> </w:t>
+      </w:r>
+      <w:r>
+        <w:rPr>
+          <w:rFonts w:hint="default" w:eastAsia="sans-serif" w:cs="Times New Roman"/>
+          <w:b w:val="0"/>
+          <w:bCs w:val="0"/>
+          <w:kern w:val="0"/>
+          <w:sz w:val="24"/>
+          <w:szCs w:val="24"/>
+          <w:lang w:val="en-US" w:eastAsia="zh-CN" w:bidi="ar"/>
+        </w:rPr>
+        <w:t>the</w:t>
+      </w:r>
+      <w:r>
+        <w:rPr>
+          <w:rFonts w:hint="default" w:ascii="Times New Roman" w:hAnsi="Times New Roman" w:eastAsia="sans-serif" w:cs="Times New Roman"/>
+          <w:b w:val="0"/>
+          <w:bCs w:val="0"/>
+          <w:kern w:val="0"/>
+          <w:sz w:val="24"/>
+          <w:szCs w:val="24"/>
+          <w:lang w:val="en-US" w:eastAsia="zh-CN" w:bidi="ar"/>
+        </w:rPr>
+        <w:t xml:space="preserve"> following issues </w:t>
+      </w:r>
+      <w:r>
+        <w:rPr>
+          <w:rFonts w:hint="default" w:eastAsia="sans-serif" w:cs="Times New Roman"/>
+          <w:b w:val="0"/>
+          <w:bCs w:val="0"/>
+          <w:kern w:val="0"/>
+          <w:sz w:val="24"/>
+          <w:szCs w:val="24"/>
+          <w:lang w:val="en-US" w:eastAsia="zh-CN" w:bidi="ar"/>
+        </w:rPr>
+        <w:t>including</w:t>
+      </w:r>
+      <w:r>
+        <w:rPr>
+          <w:rFonts w:hint="default" w:ascii="Times New Roman" w:hAnsi="Times New Roman" w:eastAsia="sans-serif" w:cs="Times New Roman"/>
+          <w:b w:val="0"/>
+          <w:bCs w:val="0"/>
+          <w:kern w:val="0"/>
+          <w:sz w:val="24"/>
+          <w:szCs w:val="24"/>
+          <w:lang w:val="en-US" w:eastAsia="zh-CN" w:bidi="ar"/>
+        </w:rPr>
+        <w:t xml:space="preserve"> operational bottlenecks, customer dissatisfaction, and restricted organizational scalability due to fragmented, manual processes across vehicle allocation, driver tracking, order processing, and branch-specific workflows. </w:t>
+      </w:r>
+      <w:r>
+        <w:rPr>
+          <w:rFonts w:hint="default" w:eastAsia="sans-serif" w:cs="Times New Roman"/>
+          <w:b w:val="0"/>
+          <w:bCs w:val="0"/>
+          <w:kern w:val="0"/>
+          <w:sz w:val="24"/>
+          <w:szCs w:val="24"/>
+          <w:lang w:val="en-US" w:eastAsia="zh-CN" w:bidi="ar"/>
+        </w:rPr>
+        <w:t>Consequently</w:t>
+      </w:r>
+      <w:r>
+        <w:rPr>
+          <w:rFonts w:hint="default" w:ascii="Times New Roman" w:hAnsi="Times New Roman" w:eastAsia="sans-serif" w:cs="Times New Roman"/>
+          <w:b w:val="0"/>
+          <w:bCs w:val="0"/>
+          <w:kern w:val="0"/>
+          <w:sz w:val="24"/>
+          <w:szCs w:val="24"/>
+          <w:lang w:val="en-US" w:eastAsia="zh-CN" w:bidi="ar"/>
+        </w:rPr>
+        <w:t>, the SmartFM system</w:t>
+      </w:r>
+      <w:r>
+        <w:rPr>
+          <w:rFonts w:hint="default" w:eastAsia="sans-serif" w:cs="Times New Roman"/>
+          <w:b w:val="0"/>
+          <w:bCs w:val="0"/>
+          <w:kern w:val="0"/>
+          <w:sz w:val="24"/>
+          <w:szCs w:val="24"/>
+          <w:lang w:val="en-US" w:eastAsia="zh-CN" w:bidi="ar"/>
+        </w:rPr>
+        <w:t xml:space="preserve"> is generated to</w:t>
+      </w:r>
+      <w:r>
+        <w:rPr>
+          <w:rFonts w:hint="default" w:ascii="Times New Roman" w:hAnsi="Times New Roman" w:eastAsia="sans-serif" w:cs="Times New Roman"/>
+          <w:b w:val="0"/>
+          <w:bCs w:val="0"/>
+          <w:kern w:val="0"/>
+          <w:sz w:val="24"/>
+          <w:szCs w:val="24"/>
+          <w:lang w:val="en-US" w:eastAsia="zh-CN" w:bidi="ar"/>
+        </w:rPr>
+        <w:t xml:space="preserve"> integrate in-branch, web, and mobile applications into a unified platform that optimizes resource scheduling, provides real-time shipment visibility, and aggregates comprehensive utilization statistics.</w:t>
       </w:r>
       <w:r>
         <w:rPr>
@@ -1996,53 +2213,101 @@
         <w:jc w:val="both"/>
         <w:rPr>
           <w:rFonts w:hint="default" w:ascii="Times New Roman" w:hAnsi="Times New Roman" w:cs="Times New Roman"/>
+          <w:b w:val="0"/>
+          <w:bCs w:val="0"/>
+          <w:sz w:val="24"/>
+          <w:szCs w:val="24"/>
         </w:rPr>
       </w:pPr>
       <w:r>
         <w:rPr>
           <w:rFonts w:hint="default" w:ascii="Times New Roman" w:hAnsi="Times New Roman" w:eastAsia="sans-serif" w:cs="Times New Roman"/>
+          <w:b w:val="0"/>
+          <w:bCs w:val="0"/>
           <w:kern w:val="0"/>
           <w:sz w:val="24"/>
           <w:szCs w:val="24"/>
           <w:lang w:val="en-US" w:eastAsia="zh-CN" w:bidi="ar"/>
         </w:rPr>
-        <w:t>In detail, the document emphasizes the initial object-oriented system design for the platform by utilizing the Responsibility-Driven Design (RDD) framework</w:t>
+        <w:t xml:space="preserve">In detail, the </w:t>
+      </w:r>
+      <w:r>
+        <w:rPr>
+          <w:rFonts w:hint="default" w:eastAsia="sans-serif" w:cs="Times New Roman"/>
+          <w:b w:val="0"/>
+          <w:bCs w:val="0"/>
+          <w:kern w:val="0"/>
+          <w:sz w:val="24"/>
+          <w:szCs w:val="24"/>
+          <w:lang w:val="en-US" w:eastAsia="zh-CN" w:bidi="ar"/>
+        </w:rPr>
+        <w:t>second document</w:t>
       </w:r>
       <w:r>
         <w:rPr>
           <w:rFonts w:hint="default" w:ascii="Times New Roman" w:hAnsi="Times New Roman" w:eastAsia="sans-serif" w:cs="Times New Roman"/>
+          <w:b w:val="0"/>
+          <w:bCs w:val="0"/>
           <w:kern w:val="0"/>
           <w:sz w:val="24"/>
           <w:szCs w:val="24"/>
           <w:lang w:val="en-US" w:eastAsia="zh-CN" w:bidi="ar"/>
         </w:rPr>
-        <w:t xml:space="preserve">. Furthermore, the design maps project requirements and logistics workflows into a clean taxonomy of structural classes, data-holders, and dynamic </w:t>
+        <w:t xml:space="preserve"> emphasizes the initial object-oriented system design for the </w:t>
+      </w:r>
+      <w:r>
+        <w:rPr>
+          <w:rFonts w:hint="default" w:eastAsia="sans-serif" w:cs="Times New Roman"/>
+          <w:b w:val="0"/>
+          <w:bCs w:val="0"/>
+          <w:kern w:val="0"/>
+          <w:sz w:val="24"/>
+          <w:szCs w:val="24"/>
+          <w:lang w:val="en-US" w:eastAsia="zh-CN" w:bidi="ar"/>
+        </w:rPr>
+        <w:t>centralized platform</w:t>
       </w:r>
       <w:r>
         <w:rPr>
           <w:rFonts w:hint="default" w:ascii="Times New Roman" w:hAnsi="Times New Roman" w:eastAsia="sans-serif" w:cs="Times New Roman"/>
-          <w:b/>
-          <w:bCs/>
+          <w:b w:val="0"/>
+          <w:bCs w:val="0"/>
           <w:kern w:val="0"/>
           <w:sz w:val="24"/>
           <w:szCs w:val="24"/>
           <w:lang w:val="en-US" w:eastAsia="zh-CN" w:bidi="ar"/>
         </w:rPr>
-        <w:t>controllers</w:t>
+        <w:t xml:space="preserve"> by utilizing the Responsibility-Driven Design (RDD) framework. Furthermore, the </w:t>
+      </w:r>
+      <w:r>
+        <w:rPr>
+          <w:rFonts w:hint="default" w:eastAsia="sans-serif" w:cs="Times New Roman"/>
+          <w:b w:val="0"/>
+          <w:bCs w:val="0"/>
+          <w:kern w:val="0"/>
+          <w:sz w:val="24"/>
+          <w:szCs w:val="24"/>
+          <w:lang w:val="en-US" w:eastAsia="zh-CN" w:bidi="ar"/>
+        </w:rPr>
+        <w:t xml:space="preserve">proposed </w:t>
       </w:r>
       <w:r>
         <w:rPr>
           <w:rFonts w:hint="default" w:ascii="Times New Roman" w:hAnsi="Times New Roman" w:eastAsia="sans-serif" w:cs="Times New Roman"/>
+          <w:b w:val="0"/>
+          <w:bCs w:val="0"/>
           <w:kern w:val="0"/>
           <w:sz w:val="24"/>
           <w:szCs w:val="24"/>
           <w:lang w:val="en-US" w:eastAsia="zh-CN" w:bidi="ar"/>
         </w:rPr>
-        <w:t xml:space="preserve"> based on behavioral obligations and object collaborations over premature data structures. Additionally, foundational design patterns and heuristics are integrated to enforce the Open-Closed Principle, delivering a decoupled blueprint that minimizes technical debt and secures a stable foundation for downstream system implementation.</w:t>
+        <w:t>design maps project requirements and logistics workflows into a clean taxonomy of structural classes, data-holders, and dynamic controllers based on behavioral obligations and object collaborations over premature data structures. Additionally, foundational design patterns and heuristics are integrated to enforce the Open-Closed Principle, delivering a decoupled blueprint that minimizes technical debt and secures a stable foundation for downstream system implementation.</w:t>
       </w:r>
       <w:r>
         <w:rPr>
           <w:rFonts w:hint="default" w:ascii="Times New Roman" w:hAnsi="Times New Roman" w:eastAsia="SimSun" w:cs="Times New Roman"/>
+          <w:b w:val="0"/>
+          <w:bCs w:val="0"/>
           <w:kern w:val="0"/>
           <w:sz w:val="24"/>
           <w:szCs w:val="24"/>
@@ -2050,6 +2315,107 @@
         </w:rPr>
         <w:t xml:space="preserve"> </w:t>
       </w:r>
+    </w:p>
+    <w:p>
+      <w:pPr>
+        <w:pStyle w:val="3"/>
+        <w:bidi w:val="0"/>
+        <w:spacing w:line="240" w:lineRule="auto"/>
+        <w:ind w:left="400" w:leftChars="100" w:firstLine="0" w:firstLineChars="0"/>
+        <w:rPr>
+          <w:rFonts w:hint="default" w:cs="Times New Roman"/>
+          <w:lang w:val="en-US"/>
+        </w:rPr>
+      </w:pPr>
+      <w:r>
+        <w:rPr>
+          <w:rFonts w:hint="default" w:ascii="Times New Roman" w:hAnsi="Times New Roman" w:cs="Times New Roman"/>
+          <w:lang w:val="en-US"/>
+        </w:rPr>
+        <w:t>1.</w:t>
+      </w:r>
+      <w:r>
+        <w:rPr>
+          <w:rFonts w:hint="default" w:cs="Times New Roman"/>
+          <w:lang w:val="en-US"/>
+        </w:rPr>
+        <w:t>2</w:t>
+      </w:r>
+      <w:r>
+        <w:rPr>
+          <w:rFonts w:hint="default" w:ascii="Times New Roman" w:hAnsi="Times New Roman" w:cs="Times New Roman"/>
+          <w:lang w:val="en-US"/>
+        </w:rPr>
+        <w:t xml:space="preserve"> </w:t>
+      </w:r>
+      <w:r>
+        <w:rPr>
+          <w:rFonts w:hint="default" w:cs="Times New Roman"/>
+          <w:lang w:val="en-US"/>
+        </w:rPr>
+        <w:t>Purpose and Architectural Scope</w:t>
+      </w:r>
+    </w:p>
+    <w:p>
+      <w:pPr>
+        <w:spacing w:line="240" w:lineRule="auto"/>
+        <w:ind w:left="400" w:leftChars="100" w:firstLine="0" w:firstLineChars="0"/>
+        <w:jc w:val="both"/>
+        <w:rPr>
+          <w:rFonts w:hint="default" w:ascii="Times New Roman" w:hAnsi="Times New Roman" w:eastAsia="SimSun" w:cs="Times New Roman"/>
+          <w:b w:val="0"/>
+          <w:bCs w:val="0"/>
+          <w:sz w:val="24"/>
+          <w:szCs w:val="24"/>
+        </w:rPr>
+      </w:pPr>
+      <w:r>
+        <w:rPr>
+          <w:rFonts w:hint="default" w:ascii="Times New Roman" w:hAnsi="Times New Roman" w:eastAsia="SimSun" w:cs="Times New Roman"/>
+          <w:b w:val="0"/>
+          <w:bCs w:val="0"/>
+          <w:sz w:val="24"/>
+          <w:szCs w:val="24"/>
+        </w:rPr>
+        <w:t>Next, the primary purpose of the second report focuses on translating functional system requirements from the first assignment to a clear network of software classes and defin</w:t>
+      </w:r>
+      <w:r>
+        <w:rPr>
+          <w:rFonts w:hint="default" w:ascii="Times New Roman" w:hAnsi="Times New Roman" w:eastAsia="SimSun" w:cs="Times New Roman"/>
+          <w:b w:val="0"/>
+          <w:bCs w:val="0"/>
+          <w:sz w:val="24"/>
+          <w:szCs w:val="24"/>
+          <w:lang w:val="en-US"/>
+        </w:rPr>
+        <w:t>ing</w:t>
+      </w:r>
+      <w:bookmarkStart w:id="1" w:name="_GoBack"/>
+      <w:bookmarkEnd w:id="1"/>
+      <w:r>
+        <w:rPr>
+          <w:rFonts w:hint="default" w:ascii="Times New Roman" w:hAnsi="Times New Roman" w:eastAsia="SimSun" w:cs="Times New Roman"/>
+          <w:b w:val="0"/>
+          <w:bCs w:val="0"/>
+          <w:sz w:val="24"/>
+          <w:szCs w:val="24"/>
+        </w:rPr>
+        <w:t xml:space="preserve"> their relationships. By leveraging proven software design patterns and heuristics, the desired design aims to strike a perfect balance between supporting complex scheduling rules, enabling real-time tracking, and ensuring high code maintainability.</w:t>
+      </w:r>
+    </w:p>
+    <w:p>
+      <w:pPr>
+        <w:spacing w:line="240" w:lineRule="auto"/>
+        <w:ind w:left="400" w:leftChars="100" w:firstLine="0" w:firstLineChars="0"/>
+        <w:jc w:val="both"/>
+        <w:rPr>
+          <w:rFonts w:hint="default" w:ascii="Times New Roman" w:hAnsi="Times New Roman" w:eastAsia="SimSun" w:cs="Times New Roman"/>
+          <w:b w:val="0"/>
+          <w:bCs w:val="0"/>
+          <w:sz w:val="24"/>
+          <w:szCs w:val="24"/>
+        </w:rPr>
+      </w:pPr>
     </w:p>
     <w:p>
       <w:pPr>
@@ -2057,14 +2423,235 @@
           <w:ilvl w:val="0"/>
           <w:numId w:val="0"/>
         </w:numPr>
-        <w:spacing w:line="240" w:lineRule="auto"/>
+        <w:ind w:left="400" w:leftChars="100" w:firstLine="0" w:firstLineChars="0"/>
         <w:jc w:val="both"/>
         <w:rPr>
-          <w:rFonts w:hint="default" w:ascii="Times New Roman" w:hAnsi="Times New Roman" w:cs="Times New Roman"/>
+          <w:rFonts w:hint="default" w:ascii="Times New Roman" w:hAnsi="Times New Roman" w:eastAsia="SimSun" w:cs="Times New Roman"/>
           <w:b w:val="0"/>
           <w:bCs w:val="0"/>
           <w:sz w:val="24"/>
           <w:szCs w:val="24"/>
+        </w:rPr>
+      </w:pPr>
+      <w:r>
+        <w:rPr>
+          <w:rFonts w:hint="default" w:ascii="Times New Roman" w:hAnsi="Times New Roman" w:eastAsia="SimSun" w:cs="Times New Roman"/>
+          <w:b w:val="0"/>
+          <w:bCs w:val="0"/>
+          <w:sz w:val="24"/>
+          <w:szCs w:val="24"/>
+        </w:rPr>
+        <w:t>In terms of architectural scope, the centralized platform is designed strictly to establish a high-level logical system architecture for the centralized Smart Fleet Management System (SmartFM) by utilizing the Responsibility-Driven Design (RDD) framework. Specifically, the boundaries of the design are explicitly defined into two parts: In-Scope and Out-of-Scope.</w:t>
+      </w:r>
+    </w:p>
+    <w:p>
+      <w:pPr>
+        <w:pStyle w:val="4"/>
+        <w:bidi w:val="0"/>
+        <w:spacing w:line="240" w:lineRule="auto"/>
+        <w:ind w:left="800" w:leftChars="200" w:firstLine="0" w:firstLineChars="0"/>
+        <w:rPr>
+          <w:rFonts w:hint="default"/>
+          <w:lang w:val="en-US"/>
+        </w:rPr>
+      </w:pPr>
+      <w:r>
+        <w:rPr>
+          <w:rFonts w:hint="default"/>
+          <w:lang w:val="en-US"/>
+        </w:rPr>
+        <w:t>1.3.1 In Scope</w:t>
+      </w:r>
+    </w:p>
+    <w:p>
+      <w:pPr>
+        <w:pStyle w:val="10"/>
+        <w:keepNext w:val="0"/>
+        <w:keepLines w:val="0"/>
+        <w:widowControl/>
+        <w:numPr>
+          <w:ilvl w:val="0"/>
+          <w:numId w:val="1"/>
+        </w:numPr>
+        <w:suppressLineNumbers w:val="0"/>
+        <w:tabs>
+          <w:tab w:val="clear" w:pos="420"/>
+        </w:tabs>
+        <w:ind w:left="1600" w:leftChars="0" w:hanging="420" w:firstLineChars="0"/>
+        <w:jc w:val="both"/>
+      </w:pPr>
+      <w:r>
+        <w:rPr>
+          <w:rFonts w:hint="default"/>
+          <w:sz w:val="24"/>
+          <w:szCs w:val="24"/>
+          <w:lang w:val="en-US"/>
+        </w:rPr>
+        <w:t xml:space="preserve">Mapping functional logistics workflows and requirements into a clean hierarchy </w:t>
+      </w:r>
+      <w:r>
+        <w:t>of structural classes, data-holders, and dynamic controllers.</w:t>
+      </w:r>
+    </w:p>
+    <w:p>
+      <w:pPr>
+        <w:pStyle w:val="10"/>
+        <w:keepNext w:val="0"/>
+        <w:keepLines w:val="0"/>
+        <w:widowControl/>
+        <w:numPr>
+          <w:ilvl w:val="0"/>
+          <w:numId w:val="1"/>
+        </w:numPr>
+        <w:suppressLineNumbers w:val="0"/>
+        <w:tabs>
+          <w:tab w:val="clear" w:pos="420"/>
+        </w:tabs>
+        <w:ind w:left="1600" w:leftChars="0" w:hanging="420" w:firstLineChars="0"/>
+        <w:jc w:val="both"/>
+      </w:pPr>
+      <w:r>
+        <w:t>Defining clear behavioral obligations, system responsibilities, and object collaborations using RDD heuristics.</w:t>
+      </w:r>
+    </w:p>
+    <w:p>
+      <w:pPr>
+        <w:pStyle w:val="10"/>
+        <w:keepNext w:val="0"/>
+        <w:keepLines w:val="0"/>
+        <w:widowControl/>
+        <w:numPr>
+          <w:ilvl w:val="0"/>
+          <w:numId w:val="1"/>
+        </w:numPr>
+        <w:suppressLineNumbers w:val="0"/>
+        <w:tabs>
+          <w:tab w:val="clear" w:pos="420"/>
+        </w:tabs>
+        <w:ind w:left="1600" w:leftChars="0" w:hanging="420" w:firstLineChars="0"/>
+        <w:jc w:val="both"/>
+        <w:rPr>
+          <w:rFonts w:hint="default"/>
+          <w:sz w:val="24"/>
+          <w:szCs w:val="24"/>
+          <w:lang w:val="en-US"/>
+        </w:rPr>
+      </w:pPr>
+      <w:r>
+        <w:t>Enforcing the Open-Closed Principle through foundational design patterns to deliver a decoupled structural blueprint.</w:t>
+      </w:r>
+    </w:p>
+    <w:p>
+      <w:pPr>
+        <w:pStyle w:val="4"/>
+        <w:bidi w:val="0"/>
+        <w:spacing w:line="240" w:lineRule="auto"/>
+        <w:ind w:left="800" w:leftChars="200" w:firstLine="0" w:firstLineChars="0"/>
+        <w:rPr>
+          <w:rFonts w:hint="default"/>
+          <w:lang w:val="en-US"/>
+        </w:rPr>
+      </w:pPr>
+      <w:r>
+        <w:rPr>
+          <w:rFonts w:hint="default"/>
+          <w:lang w:val="en-US"/>
+        </w:rPr>
+        <w:t>1.3.1 In Scope</w:t>
+      </w:r>
+    </w:p>
+    <w:p>
+      <w:pPr>
+        <w:pStyle w:val="10"/>
+        <w:keepNext w:val="0"/>
+        <w:keepLines w:val="0"/>
+        <w:widowControl/>
+        <w:numPr>
+          <w:ilvl w:val="0"/>
+          <w:numId w:val="2"/>
+        </w:numPr>
+        <w:suppressLineNumbers w:val="0"/>
+        <w:tabs>
+          <w:tab w:val="clear" w:pos="420"/>
+        </w:tabs>
+        <w:ind w:left="1600" w:leftChars="0" w:hanging="420" w:firstLineChars="0"/>
+        <w:jc w:val="both"/>
+      </w:pPr>
+      <w:r>
+        <w:t xml:space="preserve">Designing </w:t>
+      </w:r>
+      <w:r>
+        <w:rPr>
+          <w:rFonts w:hint="default"/>
+          <w:lang w:val="en-US"/>
+        </w:rPr>
+        <w:t>detailed</w:t>
+      </w:r>
+      <w:r>
+        <w:t xml:space="preserve"> database structures, concrete tables, or storage schemas.</w:t>
+      </w:r>
+    </w:p>
+    <w:p>
+      <w:pPr>
+        <w:pStyle w:val="10"/>
+        <w:keepNext w:val="0"/>
+        <w:keepLines w:val="0"/>
+        <w:widowControl/>
+        <w:numPr>
+          <w:ilvl w:val="0"/>
+          <w:numId w:val="2"/>
+        </w:numPr>
+        <w:suppressLineNumbers w:val="0"/>
+        <w:tabs>
+          <w:tab w:val="clear" w:pos="420"/>
+        </w:tabs>
+        <w:ind w:left="1600" w:leftChars="0" w:hanging="420" w:firstLineChars="0"/>
+        <w:jc w:val="both"/>
+      </w:pPr>
+      <w:r>
+        <w:t>Developing user interface (UI/UX) wireframes, layouts, or frontend component animations.</w:t>
+      </w:r>
+    </w:p>
+    <w:p>
+      <w:pPr>
+        <w:pStyle w:val="10"/>
+        <w:keepNext w:val="0"/>
+        <w:keepLines w:val="0"/>
+        <w:widowControl/>
+        <w:numPr>
+          <w:ilvl w:val="0"/>
+          <w:numId w:val="2"/>
+        </w:numPr>
+        <w:suppressLineNumbers w:val="0"/>
+        <w:tabs>
+          <w:tab w:val="clear" w:pos="420"/>
+        </w:tabs>
+        <w:ind w:left="1600" w:leftChars="0" w:hanging="420" w:firstLineChars="0"/>
+        <w:jc w:val="both"/>
+        <w:rPr>
+          <w:rFonts w:hint="default"/>
+          <w:sz w:val="24"/>
+          <w:szCs w:val="24"/>
+          <w:lang w:val="en-US"/>
+        </w:rPr>
+      </w:pPr>
+      <w:r>
+        <w:t>Writing low-level concrete source code or full field definitions for the programming environment.</w:t>
+      </w:r>
+    </w:p>
+    <w:p>
+      <w:pPr>
+        <w:pStyle w:val="4"/>
+        <w:bidi w:val="0"/>
+        <w:spacing w:line="240" w:lineRule="auto"/>
+        <w:ind w:left="800" w:leftChars="200" w:firstLine="0" w:firstLineChars="0"/>
+        <w:rPr>
+          <w:rFonts w:hint="default"/>
+          <w:b w:val="0"/>
+          <w:bCs w:val="0"/>
+          <w:sz w:val="24"/>
+          <w:szCs w:val="24"/>
+          <w:lang w:val="en-US"/>
         </w:rPr>
       </w:pPr>
     </w:p>
@@ -2074,7 +2661,7 @@
           <w:ilvl w:val="0"/>
           <w:numId w:val="0"/>
         </w:numPr>
-        <w:spacing w:line="240" w:lineRule="auto"/>
+        <w:ind w:left="400" w:leftChars="100" w:firstLine="0" w:firstLineChars="0"/>
         <w:jc w:val="both"/>
         <w:rPr>
           <w:rFonts w:hint="default" w:ascii="Times New Roman" w:hAnsi="Times New Roman" w:cs="Times New Roman"/>
@@ -2082,60 +2669,24 @@
           <w:bCs w:val="0"/>
           <w:sz w:val="24"/>
           <w:szCs w:val="24"/>
-        </w:rPr>
-      </w:pPr>
-    </w:p>
-    <w:p>
-      <w:pPr>
-        <w:spacing w:line="240" w:lineRule="auto"/>
-        <w:rPr>
-          <w:rFonts w:hint="default" w:ascii="Times New Roman" w:hAnsi="Times New Roman" w:cs="Times New Roman"/>
-          <w:lang w:val="en-US"/>
-        </w:rPr>
-      </w:pPr>
-    </w:p>
-    <w:p>
-      <w:pPr>
-        <w:numPr>
-          <w:ilvl w:val="0"/>
-          <w:numId w:val="0"/>
-        </w:numPr>
-        <w:jc w:val="both"/>
-        <w:rPr>
-          <w:rFonts w:hint="default" w:ascii="Times New Roman" w:hAnsi="Times New Roman" w:cs="Times New Roman"/>
+          <w:lang w:val="en-US"/>
+        </w:rPr>
+      </w:pPr>
+      <w:r>
+        <w:rPr>
+          <w:rFonts w:hint="default" w:ascii="Times New Roman" w:hAnsi="Times New Roman" w:eastAsia="Symbol" w:cs="Times New Roman"/>
           <w:b w:val="0"/>
           <w:bCs w:val="0"/>
           <w:sz w:val="24"/>
           <w:szCs w:val="24"/>
         </w:rPr>
-      </w:pPr>
-    </w:p>
-    <w:p>
-      <w:pPr>
-        <w:numPr>
-          <w:ilvl w:val="0"/>
-          <w:numId w:val="0"/>
-        </w:numPr>
-        <w:ind w:left="780" w:leftChars="0"/>
-        <w:jc w:val="both"/>
-        <w:rPr>
-          <w:rFonts w:hint="default" w:ascii="Times New Roman" w:hAnsi="Times New Roman" w:cs="Times New Roman"/>
-          <w:sz w:val="24"/>
-          <w:szCs w:val="24"/>
-          <w:lang w:val="en-US"/>
-        </w:rPr>
-      </w:pPr>
-      <w:r>
-        <w:rPr>
-          <w:rFonts w:hint="default" w:ascii="Times New Roman" w:hAnsi="Times New Roman" w:eastAsia="Symbol" w:cs="Times New Roman"/>
-          <w:sz w:val="24"/>
-          <w:szCs w:val="24"/>
-        </w:rPr>
         <w:t>·</w:t>
       </w:r>
       <w:r>
         <w:rPr>
           <w:rFonts w:hint="default" w:ascii="Times New Roman" w:hAnsi="Times New Roman" w:eastAsia="SimSun" w:cs="Times New Roman"/>
+          <w:b w:val="0"/>
+          <w:bCs w:val="0"/>
           <w:sz w:val="24"/>
           <w:szCs w:val="24"/>
         </w:rPr>
@@ -2196,8 +2747,6 @@
         </w:rPr>
         <w:fldChar w:fldCharType="end"/>
       </w:r>
-      <w:bookmarkStart w:id="1" w:name="_GoBack"/>
-      <w:bookmarkEnd w:id="1"/>
     </w:p>
     <w:sectPr>
       <w:pgSz w:w="11906" w:h="16838"/>
@@ -2362,6 +2911,61 @@
     </w:r>
   </w:p>
 </w:hdr>
+</file>
+
+<file path=word/numbering.xml><?xml version="1.0" encoding="utf-8"?>
+<w:numbering xmlns:wpc="http://schemas.microsoft.com/office/word/2010/wordprocessingCanvas" xmlns:mc="http://schemas.openxmlformats.org/markup-compatibility/2006" xmlns:o="urn:schemas-microsoft-com:office:office" xmlns:r="http://schemas.openxmlformats.org/officeDocument/2006/relationships" xmlns:m="http://schemas.openxmlformats.org/officeDocument/2006/math" xmlns:v="urn:schemas-microsoft-com:vml" xmlns:wp14="http://schemas.microsoft.com/office/word/2010/wordprocessingDrawing" xmlns:wp="http://schemas.openxmlformats.org/drawingml/2006/wordprocessingDrawing" xmlns:w10="urn:schemas-microsoft-com:office:word" xmlns:w="http://schemas.openxmlformats.org/wordprocessingml/2006/main" xmlns:w14="http://schemas.microsoft.com/office/word/2010/wordml" xmlns:wpg="http://schemas.microsoft.com/office/word/2010/wordprocessingGroup" xmlns:wpi="http://schemas.microsoft.com/office/word/2010/wordprocessingInk" xmlns:wne="http://schemas.microsoft.com/office/word/2006/wordml" xmlns:wps="http://schemas.microsoft.com/office/word/2010/wordprocessingShape" xmlns:wpsCustomData="http://www.wps.cn/officeDocument/2013/wpsCustomData" mc:Ignorable="w14 wp14">
+  <w:abstractNum w:abstractNumId="0">
+    <w:nsid w:val="390A40F2"/>
+    <w:multiLevelType w:val="singleLevel"/>
+    <w:tmpl w:val="390A40F2"/>
+    <w:lvl w:ilvl="0" w:tentative="0">
+      <w:start w:val="1"/>
+      <w:numFmt w:val="bullet"/>
+      <w:lvlText w:val=""/>
+      <w:lvlJc w:val="left"/>
+      <w:pPr>
+        <w:tabs>
+          <w:tab w:val="left" w:pos="420"/>
+        </w:tabs>
+        <w:ind w:left="420" w:leftChars="0" w:hanging="420" w:firstLineChars="0"/>
+      </w:pPr>
+      <w:rPr>
+        <w:rFonts w:hint="default" w:ascii="Wingdings" w:hAnsi="Wingdings"/>
+        <w:sz w:val="15"/>
+        <w:szCs w:val="15"/>
+      </w:rPr>
+    </w:lvl>
+  </w:abstractNum>
+  <w:abstractNum w:abstractNumId="1">
+    <w:nsid w:val="40B96B38"/>
+    <w:multiLevelType w:val="singleLevel"/>
+    <w:tmpl w:val="40B96B38"/>
+    <w:lvl w:ilvl="0" w:tentative="0">
+      <w:start w:val="1"/>
+      <w:numFmt w:val="bullet"/>
+      <w:lvlText w:val=""/>
+      <w:lvlJc w:val="left"/>
+      <w:pPr>
+        <w:tabs>
+          <w:tab w:val="left" w:pos="420"/>
+        </w:tabs>
+        <w:ind w:left="420" w:leftChars="0" w:hanging="420" w:firstLineChars="0"/>
+      </w:pPr>
+      <w:rPr>
+        <w:rFonts w:hint="default" w:ascii="Wingdings" w:hAnsi="Wingdings"/>
+        <w:sz w:val="15"/>
+        <w:szCs w:val="15"/>
+      </w:rPr>
+    </w:lvl>
+  </w:abstractNum>
+  <w:num w:numId="1">
+    <w:abstractNumId w:val="1"/>
+  </w:num>
+  <w:num w:numId="2">
+    <w:abstractNumId w:val="0"/>
+  </w:num>
+</w:numbering>
 </file>
 
 <file path=word/styles.xml><?xml version="1.0" encoding="utf-8"?>

</xml_diff>